<commit_message>
Byt oliens perspektiveringsdel ud med en densitetsmåling
Del 3 om olieforbrug, produktion og oliereserver er ude — med den også de tre
figurer fra Energistyrelsen og World Oil Review, som den hvilede på. I stedet
vejer eleverne 100 mL vand og 100 mL madolie og regner densiteten ud med
ρ = m/V. Det er den måling, originalens formål peger på ("at knytte migrationen
til densitet"), og den forklarer direkte, hvad de så i glasset i del 2.

Materialelisten har fået måleglas og vægt, og oversigten og geografisiden er
rettet til. Alle tre formater er renderet igen.
</commit_message>
<xml_diff>
--- a/Øvelser/Geografi/oliens-migration/oliens-migration.docx
+++ b/Øvelser/Geografi/oliens-migration/oliens-migration.docx
@@ -1,6 +1,6 @@
 
 <file path=word/document.xml><?xml version="1.0" encoding="utf-8"?>
-<w:document xmlns:a="http://schemas.openxmlformats.org/drawingml/2006/main" xmlns:pic="http://schemas.openxmlformats.org/drawingml/2006/picture" xmlns:r="http://schemas.openxmlformats.org/officeDocument/2006/relationships" xmlns:w="http://schemas.openxmlformats.org/wordprocessingml/2006/main" xmlns:wp="http://schemas.openxmlformats.org/drawingml/2006/wordprocessingDrawing">
+<w:document xmlns:a="http://schemas.openxmlformats.org/drawingml/2006/main" xmlns:m="http://schemas.openxmlformats.org/officeDocument/2006/math" xmlns:pic="http://schemas.openxmlformats.org/drawingml/2006/picture" xmlns:r="http://schemas.openxmlformats.org/officeDocument/2006/relationships" xmlns:w="http://schemas.openxmlformats.org/wordprocessingml/2006/main" xmlns:wp="http://schemas.openxmlformats.org/drawingml/2006/wordprocessingDrawing">
   <w:body>
     <w:p>
       <w:pPr>
@@ -126,13 +126,13 @@
           <w:b/>
           <w:bCs/>
         </w:rPr>
-        <w:t xml:space="preserve">Perspektivering</w:t>
+        <w:t xml:space="preserve">Oliens densitet</w:t>
       </w:r>
       <w:r>
         <w:t xml:space="preserve"> </w:t>
       </w:r>
       <w:r>
-        <w:t xml:space="preserve">— olieforbrug, -produktion og -forekomster.</w:t>
+        <w:t xml:space="preserve">— måling af den forskel, der driver migrationen.</w:t>
       </w:r>
     </w:p>
     <w:bookmarkEnd w:id="19"/>
@@ -999,6 +999,30 @@
               <w:t xml:space="preserve">Madolie</w:t>
             </w:r>
           </w:p>
+          <w:p>
+            <w:pPr>
+              <w:pStyle w:val="Compact"/>
+              <w:numPr>
+                <w:ilvl w:val="0"/>
+                <w:numId w:val="1003"/>
+              </w:numPr>
+            </w:pPr>
+            <w:r>
+              <w:t xml:space="preserve">Måleglas, 100 mL</w:t>
+            </w:r>
+          </w:p>
+          <w:p>
+            <w:pPr>
+              <w:pStyle w:val="Compact"/>
+              <w:numPr>
+                <w:ilvl w:val="0"/>
+                <w:numId w:val="1003"/>
+              </w:numPr>
+            </w:pPr>
+            <w:r>
+              <w:t xml:space="preserve">Vægt (0,1 g eller finere)</w:t>
+            </w:r>
+          </w:p>
           <w:p/>
         </w:tc>
       </w:tr>
@@ -1382,13 +1406,30 @@
     </w:p>
     <w:bookmarkEnd w:id="40"/>
     <w:bookmarkEnd w:id="41"/>
-    <w:bookmarkStart w:id="56" w:name="Xff97043699086f41eb1c17b07eb1b21813844a7"/>
+    <w:bookmarkStart w:id="48" w:name="del-3-oliens-densitet"/>
     <w:p>
       <w:pPr>
         <w:pStyle w:val="Heading2"/>
       </w:pPr>
       <w:r>
-        <w:t xml:space="preserve">Del 3: Olieforbrug, produktion og forekomster</w:t>
+        <w:t xml:space="preserve">Del 3: Oliens densitet</w:t>
+      </w:r>
+    </w:p>
+    <w:p>
+      <w:pPr>
+        <w:pStyle w:val="FirstParagraph"/>
+      </w:pPr>
+      <w:r>
+        <w:t xml:space="preserve">Forsøget i del 2 virker kun, fordi olien er lettere end vandet. Her sætter I tal på forskellen.</w:t>
+      </w:r>
+    </w:p>
+    <w:bookmarkStart w:id="43" w:name="fremgangsmåde-1"/>
+    <w:p>
+      <w:pPr>
+        <w:pStyle w:val="Heading3"/>
+      </w:pPr>
+      <w:r>
+        <w:t xml:space="preserve">Fremgangsmåde</w:t>
       </w:r>
     </w:p>
     <w:p>
@@ -1400,38 +1441,43 @@
         </w:numPr>
       </w:pPr>
       <w:r>
-        <w:t xml:space="preserve">Gennemgå udviklingen i Danmarks forbrug af olie og naturgas ud fra</w:t>
-      </w:r>
-      <w:r>
-        <w:t xml:space="preserve"> </w:t>
-      </w:r>
-      <w:hyperlink w:anchor="fig-olie">
-        <w:r>
-          <w:rPr>
-            <w:rStyle w:val="Hyperlink"/>
-          </w:rPr>
-          <w:t xml:space="preserve">Figur 3</w:t>
-        </w:r>
-      </w:hyperlink>
-      <w:r>
-        <w:t xml:space="preserve"> </w:t>
-      </w:r>
-      <w:r>
-        <w:t xml:space="preserve">og</w:t>
-      </w:r>
-      <w:r>
-        <w:t xml:space="preserve"> </w:t>
-      </w:r>
-      <w:hyperlink w:anchor="fig-gas">
-        <w:r>
-          <w:rPr>
-            <w:rStyle w:val="Hyperlink"/>
-          </w:rPr>
-          <w:t xml:space="preserve">Figur 4</w:t>
-        </w:r>
-      </w:hyperlink>
-      <w:r>
-        <w:t xml:space="preserve">, og kom ind på, hvorvidt Danmark fortsat er selvforsynende med disse energiråstoffer.</w:t>
+        <w:t xml:space="preserve">Vej et tomt, tørt måleglas, og notér massen.</w:t>
+      </w:r>
+    </w:p>
+    <w:p>
+      <w:pPr>
+        <w:pStyle w:val="Compact"/>
+        <w:numPr>
+          <w:ilvl w:val="0"/>
+          <w:numId w:val="1005"/>
+        </w:numPr>
+      </w:pPr>
+      <w:r>
+        <w:t xml:space="preserve">Afmål præcis 100 mL vand i måleglasset, og vej det igen.</w:t>
+      </w:r>
+    </w:p>
+    <w:p>
+      <w:pPr>
+        <w:pStyle w:val="Compact"/>
+        <w:numPr>
+          <w:ilvl w:val="0"/>
+          <w:numId w:val="1005"/>
+        </w:numPr>
+      </w:pPr>
+      <w:r>
+        <w:t xml:space="preserve">Tøm og tør måleglasset — eller tag et andet, tørt måleglas af samme slags.</w:t>
+      </w:r>
+    </w:p>
+    <w:p>
+      <w:pPr>
+        <w:pStyle w:val="Compact"/>
+        <w:numPr>
+          <w:ilvl w:val="0"/>
+          <w:numId w:val="1005"/>
+        </w:numPr>
+      </w:pPr>
+      <w:r>
+        <w:t xml:space="preserve">Afmål præcis 100 mL madolie, og vej på samme måde.</w:t>
       </w:r>
     </w:p>
     <w:tbl>
@@ -1447,55 +1493,7 @@
       <w:tr>
         <w:tc>
           <w:tcPr/>
-          <w:bookmarkStart w:id="45" w:name="fig-olie"/>
-          <w:p>
-            <w:pPr>
-              <w:pStyle w:val="Compact"/>
-              <w:jc w:val="center"/>
-            </w:pPr>
-            <w:r>
-              <w:drawing>
-                <wp:inline>
-                  <wp:extent cx="3049019" cy="1367012"/>
-                  <wp:effectExtent b="0" l="0" r="0" t="0"/>
-                  <wp:docPr descr="" title="" id="43" name="Picture"/>
-                  <a:graphic>
-                    <a:graphicData uri="http://schemas.openxmlformats.org/drawingml/2006/picture">
-                      <pic:pic>
-                        <pic:nvPicPr>
-                          <pic:cNvPr descr="figurer/olieproduktion.png" id="44" name="Picture"/>
-                          <pic:cNvPicPr>
-                            <a:picLocks noChangeArrowheads="1" noChangeAspect="1"/>
-                          </pic:cNvPicPr>
-                        </pic:nvPicPr>
-                        <pic:blipFill>
-                          <a:blip r:embed="rId42"/>
-                          <a:stretch>
-                            <a:fillRect/>
-                          </a:stretch>
-                        </pic:blipFill>
-                        <pic:spPr bwMode="auto">
-                          <a:xfrm>
-                            <a:off x="0" y="0"/>
-                            <a:ext cx="3049019" cy="1367012"/>
-                          </a:xfrm>
-                          <a:prstGeom prst="rect">
-                            <a:avLst/>
-                          </a:prstGeom>
-                          <a:noFill/>
-                          <a:ln w="9525">
-                            <a:noFill/>
-                            <a:headEnd/>
-                            <a:tailEnd/>
-                          </a:ln>
-                        </pic:spPr>
-                      </pic:pic>
-                    </a:graphicData>
-                  </a:graphic>
-                </wp:inline>
-              </w:drawing>
-            </w:r>
-          </w:p>
+          <w:bookmarkStart w:id="42" w:name="tbl-3"/>
           <w:p>
             <w:pPr>
               <w:jc w:val="center"/>
@@ -1506,20 +1504,230 @@
               <w:pStyle w:val="ImageCaption"/>
             </w:pPr>
             <w:r>
-              <w:t xml:space="preserve">Figur 3: Produktion og langsigtet prognose for olie. Kilde: Energistyrelsens ressourceopgørelse (2018).</w:t>
+              <w:t xml:space="preserve">Tabel 3: Vejninger til bestemmelse af densiteten.</w:t>
             </w:r>
           </w:p>
-          <w:bookmarkEnd w:id="45"/>
+          <w:tbl>
+            <w:tblPr>
+              <w:tblStyle w:val="Table"/>
+              <w:tblW w:type="auto" w:w="0"/>
+              <w:tblLook w:firstRow="1" w:lastRow="0" w:firstColumn="0" w:lastColumn="0" w:noHBand="0" w:noVBand="0" w:val="0020"/>
+            </w:tblPr>
+            <w:tblGrid>
+              <w:gridCol w:w="2640"/>
+              <w:gridCol w:w="2640"/>
+              <w:gridCol w:w="2640"/>
+            </w:tblGrid>
+            <w:tr>
+              <w:trPr>
+                <w:cantSplit/>
+                <w:tblHeader w:val="on"/>
+              </w:trPr>
+              <w:tc>
+                <w:tcPr/>
+                <w:p>
+                  <w:pPr>
+                    <w:pStyle w:val="Compact"/>
+                    <w:keepNext/>
+                  </w:pPr>
+                </w:p>
+              </w:tc>
+              <w:tc>
+                <w:tcPr/>
+                <w:p>
+                  <w:pPr>
+                    <w:pStyle w:val="Compact"/>
+                    <w:keepNext/>
+                    <w:jc w:val="center"/>
+                    <w:jc w:val="center"/>
+                  </w:pPr>
+                  <w:r>
+                    <w:t xml:space="preserve">Vand</w:t>
+                  </w:r>
+                </w:p>
+              </w:tc>
+              <w:tc>
+                <w:tcPr/>
+                <w:p>
+                  <w:pPr>
+                    <w:pStyle w:val="Compact"/>
+                    <w:keepNext/>
+                    <w:jc w:val="center"/>
+                    <w:jc w:val="center"/>
+                  </w:pPr>
+                  <w:r>
+                    <w:t xml:space="preserve">Madolie</w:t>
+                  </w:r>
+                </w:p>
+              </w:tc>
+            </w:tr>
+            <w:tr>
+              <w:trPr>
+                <w:cantSplit/>
+              </w:trPr>
+              <w:tc>
+                <w:tcPr/>
+                <w:p>
+                  <w:pPr>
+                    <w:pStyle w:val="Compact"/>
+                    <w:keepNext/>
+                    <w:jc w:val="left"/>
+                    <w:jc w:val="center"/>
+                  </w:pPr>
+                  <w:r>
+                    <w:t xml:space="preserve">Masse af tomt måleglas (g)</w:t>
+                  </w:r>
+                </w:p>
+              </w:tc>
+              <w:tc>
+                <w:tcPr/>
+                <w:p>
+                  <w:pPr>
+                    <w:pStyle w:val="Compact"/>
+                    <w:keepNext/>
+                  </w:pPr>
+                </w:p>
+              </w:tc>
+              <w:tc>
+                <w:tcPr/>
+                <w:p>
+                  <w:pPr>
+                    <w:pStyle w:val="Compact"/>
+                    <w:keepNext/>
+                  </w:pPr>
+                </w:p>
+              </w:tc>
+            </w:tr>
+            <w:tr>
+              <w:trPr>
+                <w:cantSplit/>
+              </w:trPr>
+              <w:tc>
+                <w:tcPr/>
+                <w:p>
+                  <w:pPr>
+                    <w:pStyle w:val="Compact"/>
+                    <w:keepNext/>
+                    <w:jc w:val="left"/>
+                    <w:jc w:val="center"/>
+                  </w:pPr>
+                  <w:r>
+                    <w:t xml:space="preserve">Masse af måleglas med 100 mL væske (g)</w:t>
+                  </w:r>
+                </w:p>
+              </w:tc>
+              <w:tc>
+                <w:tcPr/>
+                <w:p>
+                  <w:pPr>
+                    <w:pStyle w:val="Compact"/>
+                    <w:keepNext/>
+                  </w:pPr>
+                </w:p>
+              </w:tc>
+              <w:tc>
+                <w:tcPr/>
+                <w:p>
+                  <w:pPr>
+                    <w:pStyle w:val="Compact"/>
+                    <w:keepNext/>
+                  </w:pPr>
+                </w:p>
+              </w:tc>
+            </w:tr>
+            <w:tr>
+              <w:trPr>
+                <w:cantSplit/>
+              </w:trPr>
+              <w:tc>
+                <w:tcPr/>
+                <w:p>
+                  <w:pPr>
+                    <w:pStyle w:val="Compact"/>
+                    <w:jc w:val="left"/>
+                    <w:jc w:val="center"/>
+                  </w:pPr>
+                  <w:r>
+                    <w:t xml:space="preserve">Væskens masse (g)</w:t>
+                  </w:r>
+                </w:p>
+              </w:tc>
+              <w:tc>
+                <w:tcPr/>
+                <w:p>
+                  <w:pPr>
+                    <w:pStyle w:val="Compact"/>
+                  </w:pPr>
+                </w:p>
+              </w:tc>
+              <w:tc>
+                <w:tcPr/>
+                <w:p>
+                  <w:pPr>
+                    <w:pStyle w:val="Compact"/>
+                  </w:pPr>
+                </w:p>
+              </w:tc>
+            </w:tr>
+          </w:tbl>
+          <w:bookmarkEnd w:id="42"/>
+          <w:p/>
         </w:tc>
       </w:tr>
     </w:tbl>
+    <w:bookmarkEnd w:id="43"/>
+    <w:bookmarkStart w:id="47" w:name="beregning"/>
+    <w:p>
+      <w:pPr>
+        <w:pStyle w:val="Heading3"/>
+      </w:pPr>
+      <w:r>
+        <w:t xml:space="preserve">Beregning</w:t>
+      </w:r>
+    </w:p>
+    <w:p>
+      <w:pPr>
+        <w:pStyle w:val="FirstParagraph"/>
+      </w:pPr>
+      <w:r>
+        <w:t xml:space="preserve">Densiteten er massen pr. rumfang. Rumfanget er de 100 mL, altså 100 cm³:</w:t>
+      </w:r>
+    </w:p>
     <w:p>
       <w:pPr>
         <w:pStyle w:val="BodyText"/>
       </w:pPr>
-      <w:r>
-        <w:t xml:space="preserve"> </w:t>
-      </w:r>
+      <m:oMathPara>
+        <m:oMathParaPr>
+          <m:jc m:val="center"/>
+        </m:oMathParaPr>
+        <m:oMath>
+          <m:r>
+            <m:t>ρ</m:t>
+          </m:r>
+          <m:r>
+            <m:rPr>
+              <m:sty m:val="p"/>
+            </m:rPr>
+            <m:t>=</m:t>
+          </m:r>
+          <m:f>
+            <m:fPr>
+              <m:type m:val="bar"/>
+            </m:fPr>
+            <m:num>
+              <m:r>
+                <m:t>m</m:t>
+              </m:r>
+            </m:num>
+            <m:den>
+              <m:r>
+                <m:t>V</m:t>
+              </m:r>
+            </m:den>
+          </m:f>
+        </m:oMath>
+      </m:oMathPara>
     </w:p>
     <w:tbl>
       <w:tblPr>
@@ -1534,55 +1742,7 @@
       <w:tr>
         <w:tc>
           <w:tcPr/>
-          <w:bookmarkStart w:id="49" w:name="fig-gas"/>
-          <w:p>
-            <w:pPr>
-              <w:pStyle w:val="Compact"/>
-              <w:jc w:val="center"/>
-            </w:pPr>
-            <w:r>
-              <w:drawing>
-                <wp:inline>
-                  <wp:extent cx="3067368" cy="1345605"/>
-                  <wp:effectExtent b="0" l="0" r="0" t="0"/>
-                  <wp:docPr descr="" title="" id="47" name="Picture"/>
-                  <a:graphic>
-                    <a:graphicData uri="http://schemas.openxmlformats.org/drawingml/2006/picture">
-                      <pic:pic>
-                        <pic:nvPicPr>
-                          <pic:cNvPr descr="figurer/gasproduktion.png" id="48" name="Picture"/>
-                          <pic:cNvPicPr>
-                            <a:picLocks noChangeArrowheads="1" noChangeAspect="1"/>
-                          </pic:cNvPicPr>
-                        </pic:nvPicPr>
-                        <pic:blipFill>
-                          <a:blip r:embed="rId46"/>
-                          <a:stretch>
-                            <a:fillRect/>
-                          </a:stretch>
-                        </pic:blipFill>
-                        <pic:spPr bwMode="auto">
-                          <a:xfrm>
-                            <a:off x="0" y="0"/>
-                            <a:ext cx="3067368" cy="1345605"/>
-                          </a:xfrm>
-                          <a:prstGeom prst="rect">
-                            <a:avLst/>
-                          </a:prstGeom>
-                          <a:noFill/>
-                          <a:ln w="9525">
-                            <a:noFill/>
-                            <a:headEnd/>
-                            <a:tailEnd/>
-                          </a:ln>
-                        </pic:spPr>
-                      </pic:pic>
-                    </a:graphicData>
-                  </a:graphic>
-                </wp:inline>
-              </w:drawing>
-            </w:r>
-          </w:p>
+          <w:bookmarkStart w:id="44" w:name="tbl-4"/>
           <w:p>
             <w:pPr>
               <w:jc w:val="center"/>
@@ -1593,53 +1753,103 @@
               <w:pStyle w:val="ImageCaption"/>
             </w:pPr>
             <w:r>
-              <w:t xml:space="preserve">Figur 4: Produktion og langsigtet prognose for salgsgas. Kilde: Energistyrelsens ressourceopgørelse (2019).</w:t>
+              <w:t xml:space="preserve">Tabel 4: Beregnet densitet.</w:t>
             </w:r>
           </w:p>
-          <w:bookmarkEnd w:id="49"/>
+          <w:tbl>
+            <w:tblPr>
+              <w:tblStyle w:val="Table"/>
+              <w:tblW w:type="auto" w:w="0"/>
+              <w:tblLook w:firstRow="1" w:lastRow="0" w:firstColumn="0" w:lastColumn="0" w:noHBand="0" w:noVBand="0" w:val="0020"/>
+            </w:tblPr>
+            <w:tblGrid>
+              <w:gridCol w:w="2640"/>
+              <w:gridCol w:w="2640"/>
+              <w:gridCol w:w="2640"/>
+            </w:tblGrid>
+            <w:tr>
+              <w:trPr>
+                <w:cantSplit/>
+                <w:tblHeader w:val="on"/>
+              </w:trPr>
+              <w:tc>
+                <w:tcPr/>
+                <w:p>
+                  <w:pPr>
+                    <w:pStyle w:val="Compact"/>
+                    <w:keepNext/>
+                  </w:pPr>
+                </w:p>
+              </w:tc>
+              <w:tc>
+                <w:tcPr/>
+                <w:p>
+                  <w:pPr>
+                    <w:pStyle w:val="Compact"/>
+                    <w:keepNext/>
+                    <w:jc w:val="center"/>
+                    <w:jc w:val="center"/>
+                  </w:pPr>
+                  <w:r>
+                    <w:t xml:space="preserve">Vand</w:t>
+                  </w:r>
+                </w:p>
+              </w:tc>
+              <w:tc>
+                <w:tcPr/>
+                <w:p>
+                  <w:pPr>
+                    <w:pStyle w:val="Compact"/>
+                    <w:keepNext/>
+                    <w:jc w:val="center"/>
+                    <w:jc w:val="center"/>
+                  </w:pPr>
+                  <w:r>
+                    <w:t xml:space="preserve">Madolie</w:t>
+                  </w:r>
+                </w:p>
+              </w:tc>
+            </w:tr>
+            <w:tr>
+              <w:trPr>
+                <w:cantSplit/>
+              </w:trPr>
+              <w:tc>
+                <w:tcPr/>
+                <w:p>
+                  <w:pPr>
+                    <w:pStyle w:val="Compact"/>
+                    <w:jc w:val="left"/>
+                    <w:jc w:val="center"/>
+                  </w:pPr>
+                  <w:r>
+                    <w:t xml:space="preserve">Densitet (g/cm³)</w:t>
+                  </w:r>
+                </w:p>
+              </w:tc>
+              <w:tc>
+                <w:tcPr/>
+                <w:p>
+                  <w:pPr>
+                    <w:pStyle w:val="Compact"/>
+                  </w:pPr>
+                </w:p>
+              </w:tc>
+              <w:tc>
+                <w:tcPr/>
+                <w:p>
+                  <w:pPr>
+                    <w:pStyle w:val="Compact"/>
+                  </w:pPr>
+                </w:p>
+              </w:tc>
+            </w:tr>
+          </w:tbl>
+          <w:bookmarkEnd w:id="44"/>
+          <w:p/>
         </w:tc>
       </w:tr>
     </w:tbl>
-    <w:p>
-      <w:pPr>
-        <w:pStyle w:val="BodyText"/>
-      </w:pPr>
-      <w:r>
-        <w:t xml:space="preserve">De</w:t>
-      </w:r>
-      <w:r>
-        <w:t xml:space="preserve"> </w:t>
-      </w:r>
-      <w:r>
-        <w:rPr>
-          <w:b/>
-          <w:bCs/>
-        </w:rPr>
-        <w:t xml:space="preserve">teknologiske ressourcer</w:t>
-      </w:r>
-      <w:r>
-        <w:t xml:space="preserve"> </w:t>
-      </w:r>
-      <w:r>
-        <w:t xml:space="preserve">på figurerne er et skøn for, hvor meget mere der kan indvindes med ny teknologi.</w:t>
-      </w:r>
-      <w:r>
-        <w:t xml:space="preserve"> </w:t>
-      </w:r>
-      <w:r>
-        <w:rPr>
-          <w:b/>
-          <w:bCs/>
-        </w:rPr>
-        <w:t xml:space="preserve">Efterforskningsressourcerne</w:t>
-      </w:r>
-      <w:r>
-        <w:t xml:space="preserve"> </w:t>
-      </w:r>
-      <w:r>
-        <w:t xml:space="preserve">er et skøn for indvindingen fra kommende nye fund. Begge dele er altså olie og gas, man endnu ikke har fundet eller kan hente op — ikke reserver, man ved er der.</w:t>
-      </w:r>
-    </w:p>
     <w:p>
       <w:pPr>
         <w:pStyle w:val="Compact"/>
@@ -1649,98 +1859,31 @@
         </w:numPr>
       </w:pPr>
       <w:r>
-        <w:t xml:space="preserve">Hvilke fem lande besidder de største oliereserver, og er de lande medlem af OPEC? Er Rusland i øvrigt medlem af OPEC?</w:t>
-      </w:r>
-    </w:p>
-    <w:tbl>
-      <w:tblPr>
-        <w:tblStyle w:val="Table"/>
-        <w:tblW w:type="pct" w:w="5000"/>
-        <w:tblLayout w:type="fixed"/>
-        <w:tblLook w:firstRow="0" w:lastRow="0" w:firstColumn="0" w:lastColumn="0" w:noHBand="0" w:noVBand="0" w:val="0000"/>
-      </w:tblPr>
-      <w:tblGrid>
-        <w:gridCol w:w="7920"/>
-      </w:tblGrid>
-      <w:tr>
-        <w:tc>
-          <w:tcPr/>
-          <w:bookmarkStart w:id="53" w:name="fig-reserver"/>
-          <w:p>
-            <w:pPr>
-              <w:pStyle w:val="Compact"/>
-              <w:jc w:val="center"/>
-            </w:pPr>
-            <w:r>
-              <w:drawing>
-                <wp:inline>
-                  <wp:extent cx="4023360" cy="3004325"/>
-                  <wp:effectExtent b="0" l="0" r="0" t="0"/>
-                  <wp:docPr descr="" title="" id="51" name="Picture"/>
-                  <a:graphic>
-                    <a:graphicData uri="http://schemas.openxmlformats.org/drawingml/2006/picture">
-                      <pic:pic>
-                        <pic:nvPicPr>
-                          <pic:cNvPr descr="figurer/oliereserver.png" id="52" name="Picture"/>
-                          <pic:cNvPicPr>
-                            <a:picLocks noChangeArrowheads="1" noChangeAspect="1"/>
-                          </pic:cNvPicPr>
-                        </pic:nvPicPr>
-                        <pic:blipFill>
-                          <a:blip r:embed="rId50"/>
-                          <a:stretch>
-                            <a:fillRect/>
-                          </a:stretch>
-                        </pic:blipFill>
-                        <pic:spPr bwMode="auto">
-                          <a:xfrm>
-                            <a:off x="0" y="0"/>
-                            <a:ext cx="4023360" cy="3004325"/>
-                          </a:xfrm>
-                          <a:prstGeom prst="rect">
-                            <a:avLst/>
-                          </a:prstGeom>
-                          <a:noFill/>
-                          <a:ln w="9525">
-                            <a:noFill/>
-                            <a:headEnd/>
-                            <a:tailEnd/>
-                          </a:ln>
-                        </pic:spPr>
-                      </pic:pic>
-                    </a:graphicData>
-                  </a:graphic>
-                </wp:inline>
-              </w:drawing>
-            </w:r>
-          </w:p>
-          <w:p>
-            <w:pPr>
-              <w:jc w:val="center"/>
-            </w:pPr>
-            <w:pPr>
-              <w:jc w:val="left"/>
-              <w:spacing w:before="200"/>
-              <w:pStyle w:val="ImageCaption"/>
-            </w:pPr>
-            <w:r>
-              <w:t xml:space="preserve">Figur 5: De ti lande med verdens største oliereserver og deres andel af verdens samlede reserver. Kilde: World Oil Review 2018 (tal fra 2017).</w:t>
-            </w:r>
-          </w:p>
-          <w:bookmarkEnd w:id="53"/>
-        </w:tc>
-      </w:tr>
-    </w:tbl>
+        <w:t xml:space="preserve">Hvor mange procent lettere er olien end vandet?</w:t>
+      </w:r>
+    </w:p>
     <w:p>
       <w:pPr>
         <w:pStyle w:val="Compact"/>
         <w:numPr>
           <w:ilvl w:val="0"/>
-          <w:numId w:val="1007"/>
+          <w:numId w:val="1006"/>
         </w:numPr>
       </w:pPr>
       <w:r>
-        <w:t xml:space="preserve">Tallene på figurerne er fra 2017–2019. Find de nyeste tal for Danmarks olie- og gasproduktion hos Energistyrelsen, og vurdér, hvor meget billedet har flyttet sig siden.</w:t>
+        <w:t xml:space="preserve">Brug tallene til at forklare, hvorfor olien i del 2 bevægede sig op gennem sandet — og hvorfor den bliver liggende øverst.</w:t>
+      </w:r>
+    </w:p>
+    <w:p>
+      <w:pPr>
+        <w:pStyle w:val="Compact"/>
+        <w:numPr>
+          <w:ilvl w:val="0"/>
+          <w:numId w:val="1006"/>
+        </w:numPr>
+      </w:pPr>
+      <w:r>
+        <w:t xml:space="preserve">Råolie fra Nordsøen har en densitet omkring 0,85 g/cm³, mens det salte porevand i undergrunden er tungere end 1,00 g/cm³. Hvad betyder den forskel for oliens vej op gennem undergrunden?</w:t>
       </w:r>
     </w:p>
     <w:tbl>
@@ -1785,12 +1928,12 @@
                 <wp:inline>
                   <wp:extent cx="152400" cy="152400"/>
                   <wp:effectExtent b="0" l="0" r="0" t="0"/>
-                  <wp:docPr descr="" title="" id="54" name="Picture"/>
+                  <wp:docPr descr="" title="" id="45" name="Picture"/>
                   <a:graphic>
                     <a:graphicData uri="http://schemas.openxmlformats.org/drawingml/2006/picture">
                       <pic:pic>
                         <pic:nvPicPr>
-                          <pic:cNvPr descr="/Applications/quarto/share/formats/docx/note.png" id="55" name="Picture"/>
+                          <pic:cNvPr descr="/Applications/quarto/share/formats/docx/note.png" id="46" name="Picture"/>
                           <pic:cNvPicPr>
                             <a:picLocks noChangeArrowheads="1" noChangeAspect="1"/>
                           </pic:cNvPicPr>
@@ -1872,7 +2015,8 @@
         </w:tc>
       </w:tr>
     </w:tbl>
-    <w:bookmarkEnd w:id="56"/>
+    <w:bookmarkEnd w:id="47"/>
+    <w:bookmarkEnd w:id="48"/>
     <w:sectPr>
       <w:headerReference r:id="rId7" w:type="default"/>
       <w:footerReference r:id="rId8" w:type="default"/>
@@ -2400,176 +2544,6 @@
       </w:rPr>
     </w:lvl>
   </w:abstractNum>
-  <w:abstractNum w:abstractNumId="99412">
-    <w:nsid w:val="00A99412"/>
-    <w:multiLevelType w:val="multilevel"/>
-    <w:lvl w:ilvl="0">
-      <w:start w:val="2"/>
-      <w:numFmt w:val="decimal"/>
-      <w:lvlText w:val="%1."/>
-      <w:lvlJc w:val="left"/>
-      <w:pPr>
-        <w:ind w:left="720" w:hanging="360"/>
-      </w:pPr>
-    </w:lvl>
-    <w:lvl w:ilvl="1">
-      <w:start w:val="2"/>
-      <w:numFmt w:val="decimal"/>
-      <w:lvlText w:val="%2."/>
-      <w:lvlJc w:val="left"/>
-      <w:pPr>
-        <w:ind w:left="1440" w:hanging="360"/>
-      </w:pPr>
-    </w:lvl>
-    <w:lvl w:ilvl="2">
-      <w:start w:val="2"/>
-      <w:numFmt w:val="decimal"/>
-      <w:lvlText w:val="%3."/>
-      <w:lvlJc w:val="left"/>
-      <w:pPr>
-        <w:ind w:left="2160" w:hanging="360"/>
-      </w:pPr>
-    </w:lvl>
-    <w:lvl w:ilvl="3">
-      <w:start w:val="2"/>
-      <w:numFmt w:val="decimal"/>
-      <w:lvlText w:val="%4."/>
-      <w:lvlJc w:val="left"/>
-      <w:pPr>
-        <w:ind w:left="2880" w:hanging="360"/>
-      </w:pPr>
-    </w:lvl>
-    <w:lvl w:ilvl="4">
-      <w:start w:val="2"/>
-      <w:numFmt w:val="decimal"/>
-      <w:lvlText w:val="%5."/>
-      <w:lvlJc w:val="left"/>
-      <w:pPr>
-        <w:ind w:left="3600" w:hanging="360"/>
-      </w:pPr>
-    </w:lvl>
-    <w:lvl w:ilvl="5">
-      <w:start w:val="2"/>
-      <w:numFmt w:val="decimal"/>
-      <w:lvlText w:val="%6."/>
-      <w:lvlJc w:val="left"/>
-      <w:pPr>
-        <w:ind w:left="4320" w:hanging="360"/>
-      </w:pPr>
-    </w:lvl>
-    <w:lvl w:ilvl="6">
-      <w:start w:val="2"/>
-      <w:numFmt w:val="decimal"/>
-      <w:lvlText w:val="%7."/>
-      <w:lvlJc w:val="left"/>
-      <w:pPr>
-        <w:ind w:left="5040" w:hanging="360"/>
-      </w:pPr>
-    </w:lvl>
-    <w:lvl w:ilvl="7">
-      <w:start w:val="2"/>
-      <w:numFmt w:val="decimal"/>
-      <w:lvlText w:val="%8."/>
-      <w:lvlJc w:val="left"/>
-      <w:pPr>
-        <w:ind w:left="5760" w:hanging="360"/>
-      </w:pPr>
-    </w:lvl>
-    <w:lvl w:ilvl="8">
-      <w:start w:val="2"/>
-      <w:numFmt w:val="decimal"/>
-      <w:lvlText w:val="%9."/>
-      <w:lvlJc w:val="left"/>
-      <w:pPr>
-        <w:ind w:left="6480" w:hanging="360"/>
-      </w:pPr>
-    </w:lvl>
-  </w:abstractNum>
-  <w:abstractNum w:abstractNumId="99413">
-    <w:nsid w:val="00A99413"/>
-    <w:multiLevelType w:val="multilevel"/>
-    <w:lvl w:ilvl="0">
-      <w:start w:val="3"/>
-      <w:numFmt w:val="decimal"/>
-      <w:lvlText w:val="%1."/>
-      <w:lvlJc w:val="left"/>
-      <w:pPr>
-        <w:ind w:left="720" w:hanging="360"/>
-      </w:pPr>
-    </w:lvl>
-    <w:lvl w:ilvl="1">
-      <w:start w:val="3"/>
-      <w:numFmt w:val="decimal"/>
-      <w:lvlText w:val="%2."/>
-      <w:lvlJc w:val="left"/>
-      <w:pPr>
-        <w:ind w:left="1440" w:hanging="360"/>
-      </w:pPr>
-    </w:lvl>
-    <w:lvl w:ilvl="2">
-      <w:start w:val="3"/>
-      <w:numFmt w:val="decimal"/>
-      <w:lvlText w:val="%3."/>
-      <w:lvlJc w:val="left"/>
-      <w:pPr>
-        <w:ind w:left="2160" w:hanging="360"/>
-      </w:pPr>
-    </w:lvl>
-    <w:lvl w:ilvl="3">
-      <w:start w:val="3"/>
-      <w:numFmt w:val="decimal"/>
-      <w:lvlText w:val="%4."/>
-      <w:lvlJc w:val="left"/>
-      <w:pPr>
-        <w:ind w:left="2880" w:hanging="360"/>
-      </w:pPr>
-    </w:lvl>
-    <w:lvl w:ilvl="4">
-      <w:start w:val="3"/>
-      <w:numFmt w:val="decimal"/>
-      <w:lvlText w:val="%5."/>
-      <w:lvlJc w:val="left"/>
-      <w:pPr>
-        <w:ind w:left="3600" w:hanging="360"/>
-      </w:pPr>
-    </w:lvl>
-    <w:lvl w:ilvl="5">
-      <w:start w:val="3"/>
-      <w:numFmt w:val="decimal"/>
-      <w:lvlText w:val="%6."/>
-      <w:lvlJc w:val="left"/>
-      <w:pPr>
-        <w:ind w:left="4320" w:hanging="360"/>
-      </w:pPr>
-    </w:lvl>
-    <w:lvl w:ilvl="6">
-      <w:start w:val="3"/>
-      <w:numFmt w:val="decimal"/>
-      <w:lvlText w:val="%7."/>
-      <w:lvlJc w:val="left"/>
-      <w:pPr>
-        <w:ind w:left="5040" w:hanging="360"/>
-      </w:pPr>
-    </w:lvl>
-    <w:lvl w:ilvl="7">
-      <w:start w:val="3"/>
-      <w:numFmt w:val="decimal"/>
-      <w:lvlText w:val="%8."/>
-      <w:lvlJc w:val="left"/>
-      <w:pPr>
-        <w:ind w:left="5760" w:hanging="360"/>
-      </w:pPr>
-    </w:lvl>
-    <w:lvl w:ilvl="8">
-      <w:start w:val="3"/>
-      <w:numFmt w:val="decimal"/>
-      <w:lvlText w:val="%9."/>
-      <w:lvlJc w:val="left"/>
-      <w:pPr>
-        <w:ind w:left="6480" w:hanging="360"/>
-      </w:pPr>
-    </w:lvl>
-  </w:abstractNum>
   <w:num w:numId="1">
     <w:abstractNumId w:val="1"/>
     <w:lvlOverride w:ilvl="0">
@@ -2715,63 +2689,33 @@
     </w:lvlOverride>
   </w:num>
   <w:num w:numId="1006">
-    <w:abstractNumId w:val="99412"/>
+    <w:abstractNumId w:val="99411"/>
     <w:lvlOverride w:ilvl="0">
-      <w:startOverride w:val="2"/>
+      <w:startOverride w:val="1"/>
     </w:lvlOverride>
     <w:lvlOverride w:ilvl="1">
-      <w:startOverride w:val="2"/>
+      <w:startOverride w:val="1"/>
     </w:lvlOverride>
     <w:lvlOverride w:ilvl="2">
-      <w:startOverride w:val="2"/>
+      <w:startOverride w:val="1"/>
     </w:lvlOverride>
     <w:lvlOverride w:ilvl="3">
-      <w:startOverride w:val="2"/>
+      <w:startOverride w:val="1"/>
     </w:lvlOverride>
     <w:lvlOverride w:ilvl="4">
-      <w:startOverride w:val="2"/>
+      <w:startOverride w:val="1"/>
     </w:lvlOverride>
     <w:lvlOverride w:ilvl="5">
-      <w:startOverride w:val="2"/>
+      <w:startOverride w:val="1"/>
     </w:lvlOverride>
     <w:lvlOverride w:ilvl="6">
-      <w:startOverride w:val="2"/>
+      <w:startOverride w:val="1"/>
     </w:lvlOverride>
     <w:lvlOverride w:ilvl="7">
-      <w:startOverride w:val="2"/>
+      <w:startOverride w:val="1"/>
     </w:lvlOverride>
     <w:lvlOverride w:ilvl="8">
-      <w:startOverride w:val="2"/>
-    </w:lvlOverride>
-  </w:num>
-  <w:num w:numId="1007">
-    <w:abstractNumId w:val="99413"/>
-    <w:lvlOverride w:ilvl="0">
-      <w:startOverride w:val="3"/>
-    </w:lvlOverride>
-    <w:lvlOverride w:ilvl="1">
-      <w:startOverride w:val="3"/>
-    </w:lvlOverride>
-    <w:lvlOverride w:ilvl="2">
-      <w:startOverride w:val="3"/>
-    </w:lvlOverride>
-    <w:lvlOverride w:ilvl="3">
-      <w:startOverride w:val="3"/>
-    </w:lvlOverride>
-    <w:lvlOverride w:ilvl="4">
-      <w:startOverride w:val="3"/>
-    </w:lvlOverride>
-    <w:lvlOverride w:ilvl="5">
-      <w:startOverride w:val="3"/>
-    </w:lvlOverride>
-    <w:lvlOverride w:ilvl="6">
-      <w:startOverride w:val="3"/>
-    </w:lvlOverride>
-    <w:lvlOverride w:ilvl="7">
-      <w:startOverride w:val="3"/>
-    </w:lvlOverride>
-    <w:lvlOverride w:ilvl="8">
-      <w:startOverride w:val="3"/>
+      <w:startOverride w:val="1"/>
     </w:lvlOverride>
   </w:num>
 </w:numbering>

</xml_diff>

<commit_message>
Fjern oprindelsesafsnittet i oliens migration
Noten om, hvem der lavede den oprindelige vejledning, hører ikke til i elevernes
udgave. Oplysningen står stadig i oversigtens note, i commit-historikken og i
kommentaren øverst i billedplader.py.
</commit_message>
<xml_diff>
--- a/Øvelser/Geografi/oliens-migration/oliens-migration.docx
+++ b/Øvelser/Geografi/oliens-migration/oliens-migration.docx
@@ -1406,7 +1406,7 @@
     </w:p>
     <w:bookmarkEnd w:id="40"/>
     <w:bookmarkEnd w:id="41"/>
-    <w:bookmarkStart w:id="48" w:name="del-3-oliens-densitet"/>
+    <w:bookmarkStart w:id="46" w:name="del-3-oliens-densitet"/>
     <w:p>
       <w:pPr>
         <w:pStyle w:val="Heading2"/>
@@ -1676,7 +1676,7 @@
       </w:tr>
     </w:tbl>
     <w:bookmarkEnd w:id="43"/>
-    <w:bookmarkStart w:id="47" w:name="beregning"/>
+    <w:bookmarkStart w:id="45" w:name="beregning"/>
     <w:p>
       <w:pPr>
         <w:pStyle w:val="Heading3"/>
@@ -1886,137 +1886,8 @@
         <w:t xml:space="preserve">Råolie fra Nordsøen har en densitet omkring 0,85 g/cm³, mens det salte porevand i undergrunden er tungere end 1,00 g/cm³. Hvad betyder den forskel for oliens vej op gennem undergrunden?</w:t>
       </w:r>
     </w:p>
-    <w:tbl>
-      <w:tblPr>
-        <w:tblStyle w:val="Table"/>
-        <w:tblLook w:firstRow="0" w:lastRow="0" w:firstColumn="0" w:lastColumn="0" w:noHBand="0" w:noVBand="0" w:val="0000"/>
-        <w:tblBorders>
-          <w:top w:val="single" w:sz="4" w:space="0" w:color="0758E5"/>
-          <w:left w:val="single" w:sz="24" w:space="0" w:color="0758E5"/>
-          <w:bottom w:val="single" w:sz="4" w:space="0" w:color="0758E5"/>
-          <w:right w:val="single" w:sz="4" w:space="0" w:color="0758E5"/>
-        </w:tblBorders>
-        <w:tblCellMar>
-          <w:left w:w="144" w:type="dxa"/>
-          <w:right w:w="144" w:type="dxa"/>
-        </w:tblCellMar>
-        <w:tblLook w:firstRow="0" w:lastRow="0" w:firstColumn="0" w:lastColumn="0" w:noHBand="0" w:noVBand="0" w:val="0000"/>
-      </w:tblPr>
-      <w:tr>
-        <w:trPr>
-          <w:cantSplit/>
-        </w:trPr>
-        <w:tc>
-          <w:tcPr>
-            <w:shd w:color="auto" w:fill="dae6fb" w:val="clear"/>
-            <w:tcMar>
-              <w:top w:w="92" w:type="dxa"/>
-              <w:bottom w:w="92" w:type="dxa"/>
-            </w:tcMar>
-          </w:tcPr>
-          <w:p>
-            <w:pPr>
-              <w:pStyle w:val="FirstParagraph"/>
-              <w:keepNext/>
-            </w:pPr>
-            <w:pPr>
-              <w:spacing w:before="0" w:after="0"/>
-              <w:textAlignment w:val="center"/>
-            </w:pPr>
-            <w:r>
-              <w:drawing>
-                <wp:inline>
-                  <wp:extent cx="152400" cy="152400"/>
-                  <wp:effectExtent b="0" l="0" r="0" t="0"/>
-                  <wp:docPr descr="" title="" id="45" name="Picture"/>
-                  <a:graphic>
-                    <a:graphicData uri="http://schemas.openxmlformats.org/drawingml/2006/picture">
-                      <pic:pic>
-                        <pic:nvPicPr>
-                          <pic:cNvPr descr="/Applications/quarto/share/formats/docx/note.png" id="46" name="Picture"/>
-                          <pic:cNvPicPr>
-                            <a:picLocks noChangeArrowheads="1" noChangeAspect="1"/>
-                          </pic:cNvPicPr>
-                        </pic:nvPicPr>
-                        <pic:blipFill>
-                          <a:blip r:embed="rId30"/>
-                          <a:stretch>
-                            <a:fillRect/>
-                          </a:stretch>
-                        </pic:blipFill>
-                        <pic:spPr bwMode="auto">
-                          <a:xfrm>
-                            <a:off x="0" y="0"/>
-                            <a:ext cx="152400" cy="152400"/>
-                          </a:xfrm>
-                          <a:prstGeom prst="rect">
-                            <a:avLst/>
-                          </a:prstGeom>
-                          <a:noFill/>
-                          <a:ln w="9525">
-                            <a:noFill/>
-                            <a:headEnd/>
-                            <a:tailEnd/>
-                          </a:ln>
-                        </pic:spPr>
-                      </pic:pic>
-                    </a:graphicData>
-                  </a:graphic>
-                </wp:inline>
-              </w:drawing>
-            </w:r>
-            <w:r>
-              <w:t xml:space="preserve"> </w:t>
-            </w:r>
-            <w:r>
-              <w:t xml:space="preserve"> </w:t>
-            </w:r>
-            <w:r>
-              <w:t xml:space="preserve">Oprindelse</w:t>
-            </w:r>
-          </w:p>
-        </w:tc>
-      </w:tr>
-      <w:tr>
-        <w:trPr>
-          <w:cantSplit/>
-        </w:trPr>
-        <w:tc>
-          <w:tcPr>
-            <w:tcMar>
-              <w:top w:w="108" w:type="dxa"/>
-              <w:bottom w:w="108" w:type="dxa"/>
-            </w:tcMar>
-          </w:tcPr>
-          <w:p>
-            <w:pPr>
-              <w:pStyle w:val="BodyText"/>
-            </w:pPr>
-            <w:pPr>
-              <w:spacing w:before="16" w:after="16"/>
-            </w:pPr>
-            <w:r>
-              <w:t xml:space="preserve">Vejledningen bygger på</w:t>
-            </w:r>
-            <w:r>
-              <w:t xml:space="preserve"> </w:t>
-            </w:r>
-            <w:r>
-              <w:t xml:space="preserve">“Øvelse Oliens migration”</w:t>
-            </w:r>
-            <w:r>
-              <w:t xml:space="preserve"> </w:t>
-            </w:r>
-            <w:r>
-              <w:t xml:space="preserve">(2019-udgaven), oprindeligt udarbejdet af Allan Andreasen Kortnum, Viborg Katedralskole, med senere rettelser og tilføjelser af HB. Fotografierne er fra den udgave.</w:t>
-            </w:r>
-          </w:p>
-          <w:p/>
-        </w:tc>
-      </w:tr>
-    </w:tbl>
-    <w:bookmarkEnd w:id="47"/>
-    <w:bookmarkEnd w:id="48"/>
+    <w:bookmarkEnd w:id="45"/>
+    <w:bookmarkEnd w:id="46"/>
     <w:sectPr>
       <w:headerReference r:id="rId7" w:type="default"/>
       <w:footerReference r:id="rId8" w:type="default"/>

</xml_diff>

<commit_message>
Databehandling og journalspørgsmål i olie, terrænprofil og Røjle Klint
Oliens migration: «Beregning» bliver til Databehandling, konklusion og
fejlkilder til Journalspørgsmål. Terrænprofil: kumuleret højde,
profiltegning og hældning. Røjle Klint: kystlinjens forskydning og
erosionshastighed. Terrænprofil og Røjle får fag: Naturgeografi.

Co-Authored-By: Claude Opus 5.5 <noreply@anthropic.com>
</commit_message>
<xml_diff>
--- a/Øvelser/Geografi/oliens-migration/oliens-migration.docx
+++ b/Øvelser/Geografi/oliens-migration/oliens-migration.docx
@@ -604,7 +604,7 @@
       </w:tr>
     </w:tbl>
     <w:bookmarkEnd w:id="25"/>
-    <w:bookmarkStart w:id="41" w:name="del-2-praktisk-øvelse-oliens-migration"/>
+    <w:bookmarkStart w:id="39" w:name="del-2-praktisk-øvelse-oliens-migration"/>
     <w:p>
       <w:pPr>
         <w:pStyle w:val="Heading2"/>
@@ -880,7 +880,7 @@
                     <a:graphicData uri="http://schemas.openxmlformats.org/drawingml/2006/picture">
                       <pic:pic>
                         <pic:nvPicPr>
-                          <pic:cNvPr descr="/tmp/claude-0/-home-user-smbi/7d291b92-c289-57a9-b4b8-12c4134f11be/scratchpad/qo/quarto-1.10.18/share/formats/docx/note.png" id="32" name="Picture"/>
+                          <pic:cNvPr descr="/Applications/quarto/share/formats/docx/note.png" id="32" name="Picture"/>
                           <pic:cNvPicPr>
                             <a:picLocks noChangeArrowheads="1" noChangeAspect="1"/>
                           </pic:cNvPicPr>
@@ -1066,7 +1066,7 @@
                     <a:graphicData uri="http://schemas.openxmlformats.org/drawingml/2006/picture">
                       <pic:pic>
                         <pic:nvPicPr>
-                          <pic:cNvPr descr="/tmp/claude-0/-home-user-smbi/7d291b92-c289-57a9-b4b8-12c4134f11be/scratchpad/qo/quarto-1.10.18/share/formats/docx/tip.png" id="35" name="Picture"/>
+                          <pic:cNvPr descr="/Applications/quarto/share/formats/docx/tip.png" id="35" name="Picture"/>
                           <pic:cNvPicPr>
                             <a:picLocks noChangeArrowheads="1" noChangeAspect="1"/>
                           </pic:cNvPicPr>
@@ -1315,13 +1315,31 @@
       </w:r>
     </w:p>
     <w:bookmarkEnd w:id="38"/>
-    <w:bookmarkStart w:id="39" w:name="konklusion-og-diskussion-af-resultater"/>
+    <w:bookmarkEnd w:id="39"/>
+    <w:bookmarkStart w:id="42" w:name="del-3-oliens-densitet"/>
+    <w:p>
+      <w:pPr>
+        <w:pStyle w:val="Heading2"/>
+      </w:pPr>
+      <w:r>
+        <w:t xml:space="preserve">Del 3: Oliens densitet</w:t>
+      </w:r>
+    </w:p>
+    <w:p>
+      <w:pPr>
+        <w:pStyle w:val="FirstParagraph"/>
+      </w:pPr>
+      <w:r>
+        <w:t xml:space="preserve">Forsøget i del 2 virker kun, fordi olien er lettere end vandet. Her sætter I tal på forskellen.</w:t>
+      </w:r>
+    </w:p>
+    <w:bookmarkStart w:id="41" w:name="fremgangsmåde-1"/>
     <w:p>
       <w:pPr>
         <w:pStyle w:val="Heading3"/>
       </w:pPr>
       <w:r>
-        <w:t xml:space="preserve">Konklusion og diskussion af resultater</w:t>
+        <w:t xml:space="preserve">Fremgangsmåde</w:t>
       </w:r>
     </w:p>
     <w:p>
@@ -1333,7 +1351,7 @@
         </w:numPr>
       </w:pPr>
       <w:r>
-        <w:t xml:space="preserve">Beskriv, hvad I ser. Relatér derefter øvelsen til teorien om oliedannelse, migration, kildebjergarter, reservoirbjergarter og oliefælder: hvilke af de begreber har vi i vores forsøg, og hvilke har vi ikke?</w:t>
+        <w:t xml:space="preserve">Vej et tomt, tørt måleglas, og notér massen.</w:t>
       </w:r>
     </w:p>
     <w:p>
@@ -1345,7 +1363,7 @@
         </w:numPr>
       </w:pPr>
       <w:r>
-        <w:t xml:space="preserve">Diskutér, hvilke energimæssige og miljømæssige konsekvenser det ville have haft, hvis oliens massefylde havde været større end vands. Hvor ville vores Nordsøolie så befinde sig i dag, og hvad ville det betyde for vores muligheder for at bruge den?</w:t>
+        <w:t xml:space="preserve">Afmål præcis 100 mL vand i måleglasset, og vej det igen.</w:t>
       </w:r>
     </w:p>
     <w:p>
@@ -1357,53 +1375,7 @@
         </w:numPr>
       </w:pPr>
       <w:r>
-        <w:t xml:space="preserve">Hvilke problemer er der forbundet med olie som energiråstof?</w:t>
-      </w:r>
-    </w:p>
-    <w:bookmarkEnd w:id="39"/>
-    <w:bookmarkStart w:id="40" w:name="fejlkilder"/>
-    <w:p>
-      <w:pPr>
-        <w:pStyle w:val="Heading3"/>
-      </w:pPr>
-      <w:r>
-        <w:t xml:space="preserve">Fejlkilder</w:t>
-      </w:r>
-    </w:p>
-    <w:p>
-      <w:pPr>
-        <w:pStyle w:val="FirstParagraph"/>
-      </w:pPr>
-      <w:r>
-        <w:t xml:space="preserve">Hvad er der for eksempel galt ved at bruge vegetabilsk olie frem for mineralsk olie? Find selv flere fejlkilder.</w:t>
-      </w:r>
-    </w:p>
-    <w:bookmarkEnd w:id="40"/>
-    <w:bookmarkEnd w:id="41"/>
-    <w:bookmarkStart w:id="46" w:name="del-3-oliens-densitet"/>
-    <w:p>
-      <w:pPr>
-        <w:pStyle w:val="Heading2"/>
-      </w:pPr>
-      <w:r>
-        <w:t xml:space="preserve">Del 3: Oliens densitet</w:t>
-      </w:r>
-    </w:p>
-    <w:p>
-      <w:pPr>
-        <w:pStyle w:val="FirstParagraph"/>
-      </w:pPr>
-      <w:r>
-        <w:t xml:space="preserve">Forsøget i del 2 virker kun, fordi olien er lettere end vandet. Her sætter I tal på forskellen.</w:t>
-      </w:r>
-    </w:p>
-    <w:bookmarkStart w:id="43" w:name="fremgangsmåde-1"/>
-    <w:p>
-      <w:pPr>
-        <w:pStyle w:val="Heading3"/>
-      </w:pPr>
-      <w:r>
-        <w:t xml:space="preserve">Fremgangsmåde</w:t>
+        <w:t xml:space="preserve">Tøm og tør måleglasset — eller tag et andet, tørt måleglas af samme slags.</w:t>
       </w:r>
     </w:p>
     <w:p>
@@ -1411,43 +1383,7 @@
         <w:pStyle w:val="Compact"/>
         <w:numPr>
           <w:ilvl w:val="0"/>
-          <w:numId w:val="1005"/>
-        </w:numPr>
-      </w:pPr>
-      <w:r>
-        <w:t xml:space="preserve">Vej et tomt, tørt måleglas, og notér massen.</w:t>
-      </w:r>
-    </w:p>
-    <w:p>
-      <w:pPr>
-        <w:pStyle w:val="Compact"/>
-        <w:numPr>
-          <w:ilvl w:val="0"/>
-          <w:numId w:val="1005"/>
-        </w:numPr>
-      </w:pPr>
-      <w:r>
-        <w:t xml:space="preserve">Afmål præcis 100 mL vand i måleglasset, og vej det igen.</w:t>
-      </w:r>
-    </w:p>
-    <w:p>
-      <w:pPr>
-        <w:pStyle w:val="Compact"/>
-        <w:numPr>
-          <w:ilvl w:val="0"/>
-          <w:numId w:val="1005"/>
-        </w:numPr>
-      </w:pPr>
-      <w:r>
-        <w:t xml:space="preserve">Tøm og tør måleglasset — eller tag et andet, tørt måleglas af samme slags.</w:t>
-      </w:r>
-    </w:p>
-    <w:p>
-      <w:pPr>
-        <w:pStyle w:val="Compact"/>
-        <w:numPr>
-          <w:ilvl w:val="0"/>
-          <w:numId w:val="1005"/>
+          <w:numId w:val="1004"/>
         </w:numPr>
       </w:pPr>
       <w:r>
@@ -1467,7 +1403,7 @@
       <w:tr>
         <w:tc>
           <w:tcPr/>
-          <w:bookmarkStart w:id="42" w:name="tbl-3"/>
+          <w:bookmarkStart w:id="40" w:name="tbl-3"/>
           <w:p>
             <w:pPr>
               <w:jc w:val="center"/>
@@ -1644,32 +1580,66 @@
               </w:tc>
             </w:tr>
           </w:tbl>
-          <w:bookmarkEnd w:id="42"/>
+          <w:bookmarkEnd w:id="40"/>
           <w:p/>
         </w:tc>
       </w:tr>
     </w:tbl>
-    <w:bookmarkEnd w:id="43"/>
-    <w:bookmarkStart w:id="45" w:name="beregning"/>
-    <w:p>
-      <w:pPr>
-        <w:pStyle w:val="Heading3"/>
-      </w:pPr>
-      <w:r>
-        <w:t xml:space="preserve">Beregning</w:t>
+    <w:bookmarkEnd w:id="41"/>
+    <w:bookmarkEnd w:id="42"/>
+    <w:bookmarkStart w:id="44" w:name="databehandling"/>
+    <w:p>
+      <w:pPr>
+        <w:pStyle w:val="Heading2"/>
+      </w:pPr>
+      <w:r>
+        <w:t xml:space="preserve">Databehandling</w:t>
+      </w:r>
+    </w:p>
+    <w:p>
+      <w:pPr>
+        <w:pStyle w:val="Compact"/>
+        <w:numPr>
+          <w:ilvl w:val="0"/>
+          <w:numId w:val="1005"/>
+        </w:numPr>
+      </w:pPr>
+      <w:r>
+        <w:t xml:space="preserve">Beregn væskernes masse i</w:t>
+      </w:r>
+      <w:r>
+        <w:t xml:space="preserve"> </w:t>
+      </w:r>
+      <w:hyperlink w:anchor="tbl-3">
+        <w:r>
+          <w:rPr>
+            <w:rStyle w:val="Hyperlink"/>
+          </w:rPr>
+          <w:t xml:space="preserve">Tabel 3</w:t>
+        </w:r>
+      </w:hyperlink>
+      <w:r>
+        <w:t xml:space="preserve"> </w:t>
+      </w:r>
+      <w:r>
+        <w:t xml:space="preserve">som forskellen mellem måleglasset med og uden væske.</w:t>
+      </w:r>
+    </w:p>
+    <w:p>
+      <w:pPr>
+        <w:pStyle w:val="Compact"/>
+        <w:numPr>
+          <w:ilvl w:val="0"/>
+          <w:numId w:val="1005"/>
+        </w:numPr>
+      </w:pPr>
+      <w:r>
+        <w:t xml:space="preserve">Beregn densiteten af vand og madolie. Densiteten er massen pr. rumfang, og rumfanget er de 100 mL, altså 100 cm³:</w:t>
       </w:r>
     </w:p>
     <w:p>
       <w:pPr>
         <w:pStyle w:val="FirstParagraph"/>
-      </w:pPr>
-      <w:r>
-        <w:t xml:space="preserve">Densiteten er massen pr. rumfang. Rumfanget er de 100 mL, altså 100 cm³:</w:t>
-      </w:r>
-    </w:p>
-    <w:p>
-      <w:pPr>
-        <w:pStyle w:val="BodyText"/>
       </w:pPr>
       <m:oMathPara>
         <m:oMathParaPr>
@@ -1716,7 +1686,7 @@
       <w:tr>
         <w:tc>
           <w:tcPr/>
-          <w:bookmarkStart w:id="44" w:name="tbl-4"/>
+          <w:bookmarkStart w:id="43" w:name="tbl-4"/>
           <w:p>
             <w:pPr>
               <w:jc w:val="center"/>
@@ -1727,7 +1697,7 @@
               <w:pStyle w:val="ImageCaption"/>
             </w:pPr>
             <w:r>
-              <w:t xml:space="preserve">Tabel 4: Beregnet densitet.</w:t>
+              <w:t xml:space="preserve">Tabel 4: Beregnet densitet sammenlignet med tabelværdier ved stuetemperatur.</w:t>
             </w:r>
           </w:p>
           <w:tbl>
@@ -1793,6 +1763,7 @@
                 <w:p>
                   <w:pPr>
                     <w:pStyle w:val="Compact"/>
+                    <w:keepNext/>
                     <w:jc w:val="left"/>
                     <w:jc w:val="center"/>
                   </w:pPr>
@@ -1806,6 +1777,89 @@
                 <w:p>
                   <w:pPr>
                     <w:pStyle w:val="Compact"/>
+                    <w:keepNext/>
+                  </w:pPr>
+                </w:p>
+              </w:tc>
+              <w:tc>
+                <w:tcPr/>
+                <w:p>
+                  <w:pPr>
+                    <w:pStyle w:val="Compact"/>
+                    <w:keepNext/>
+                  </w:pPr>
+                </w:p>
+              </w:tc>
+            </w:tr>
+            <w:tr>
+              <w:trPr>
+                <w:cantSplit/>
+              </w:trPr>
+              <w:tc>
+                <w:tcPr/>
+                <w:p>
+                  <w:pPr>
+                    <w:pStyle w:val="Compact"/>
+                    <w:keepNext/>
+                    <w:jc w:val="left"/>
+                    <w:jc w:val="center"/>
+                  </w:pPr>
+                  <w:r>
+                    <w:t xml:space="preserve">Tabelværdi (g/cm³)</w:t>
+                  </w:r>
+                </w:p>
+              </w:tc>
+              <w:tc>
+                <w:tcPr/>
+                <w:p>
+                  <w:pPr>
+                    <w:pStyle w:val="Compact"/>
+                    <w:keepNext/>
+                    <w:jc w:val="center"/>
+                    <w:jc w:val="center"/>
+                  </w:pPr>
+                  <w:r>
+                    <w:t xml:space="preserve">1,00</w:t>
+                  </w:r>
+                </w:p>
+              </w:tc>
+              <w:tc>
+                <w:tcPr/>
+                <w:p>
+                  <w:pPr>
+                    <w:pStyle w:val="Compact"/>
+                    <w:keepNext/>
+                    <w:jc w:val="center"/>
+                    <w:jc w:val="center"/>
+                  </w:pPr>
+                  <w:r>
+                    <w:t xml:space="preserve">ca. 0,92</w:t>
+                  </w:r>
+                </w:p>
+              </w:tc>
+            </w:tr>
+            <w:tr>
+              <w:trPr>
+                <w:cantSplit/>
+              </w:trPr>
+              <w:tc>
+                <w:tcPr/>
+                <w:p>
+                  <w:pPr>
+                    <w:pStyle w:val="Compact"/>
+                    <w:jc w:val="left"/>
+                    <w:jc w:val="center"/>
+                  </w:pPr>
+                  <w:r>
+                    <w:t xml:space="preserve">Afvigelse fra tabelværdien (%)</w:t>
+                  </w:r>
+                </w:p>
+              </w:tc>
+              <w:tc>
+                <w:tcPr/>
+                <w:p>
+                  <w:pPr>
+                    <w:pStyle w:val="Compact"/>
                   </w:pPr>
                 </w:p>
               </w:tc>
@@ -1819,7 +1873,7 @@
               </w:tc>
             </w:tr>
           </w:tbl>
-          <w:bookmarkEnd w:id="44"/>
+          <w:bookmarkEnd w:id="43"/>
           <w:p/>
         </w:tc>
       </w:tr>
@@ -1833,19 +1887,140 @@
         </w:numPr>
       </w:pPr>
       <w:r>
-        <w:t xml:space="preserve">Hvor mange procent lettere er olien end vandet?</w:t>
-      </w:r>
+        <w:t xml:space="preserve">Beregn, hvor mange procent lettere olien er end vandet:</w:t>
+      </w:r>
+    </w:p>
+    <w:p>
+      <w:pPr>
+        <w:pStyle w:val="FirstParagraph"/>
+      </w:pPr>
+      <m:oMathPara>
+        <m:oMathParaPr>
+          <m:jc m:val="center"/>
+        </m:oMathParaPr>
+        <m:oMath>
+          <m:r>
+            <m:rPr>
+              <m:nor/>
+              <m:sty m:val="p"/>
+            </m:rPr>
+            <m:t>Forskel (%)</m:t>
+          </m:r>
+          <m:r>
+            <m:rPr>
+              <m:sty m:val="p"/>
+            </m:rPr>
+            <m:t>=</m:t>
+          </m:r>
+          <m:f>
+            <m:fPr>
+              <m:type m:val="bar"/>
+            </m:fPr>
+            <m:num>
+              <m:sSub>
+                <m:e>
+                  <m:r>
+                    <m:t>ρ</m:t>
+                  </m:r>
+                </m:e>
+                <m:sub>
+                  <m:r>
+                    <m:rPr>
+                      <m:nor/>
+                      <m:sty m:val="p"/>
+                    </m:rPr>
+                    <m:t>vand</m:t>
+                  </m:r>
+                </m:sub>
+              </m:sSub>
+              <m:r>
+                <m:rPr>
+                  <m:sty m:val="p"/>
+                </m:rPr>
+                <m:t>−</m:t>
+              </m:r>
+              <m:sSub>
+                <m:e>
+                  <m:r>
+                    <m:t>ρ</m:t>
+                  </m:r>
+                </m:e>
+                <m:sub>
+                  <m:r>
+                    <m:rPr>
+                      <m:nor/>
+                      <m:sty m:val="p"/>
+                    </m:rPr>
+                    <m:t>olie</m:t>
+                  </m:r>
+                </m:sub>
+              </m:sSub>
+            </m:num>
+            <m:den>
+              <m:sSub>
+                <m:e>
+                  <m:r>
+                    <m:t>ρ</m:t>
+                  </m:r>
+                </m:e>
+                <m:sub>
+                  <m:r>
+                    <m:rPr>
+                      <m:nor/>
+                      <m:sty m:val="p"/>
+                    </m:rPr>
+                    <m:t>vand</m:t>
+                  </m:r>
+                </m:sub>
+              </m:sSub>
+            </m:den>
+          </m:f>
+          <m:r>
+            <m:rPr>
+              <m:sty m:val="p"/>
+            </m:rPr>
+            <m:t>⋅</m:t>
+          </m:r>
+          <m:r>
+            <m:t>100</m:t>
+          </m:r>
+        </m:oMath>
+      </m:oMathPara>
     </w:p>
     <w:p>
       <w:pPr>
         <w:pStyle w:val="Compact"/>
         <w:numPr>
           <w:ilvl w:val="0"/>
-          <w:numId w:val="1006"/>
+          <w:numId w:val="1007"/>
         </w:numPr>
       </w:pPr>
       <w:r>
-        <w:t xml:space="preserve">Brug tallene til at forklare, hvorfor olien i del 2 bevægede sig op gennem sandet — og hvorfor den bliver liggende øverst.</w:t>
+        <w:t xml:space="preserve">Sammenlign jeres målte densiteter med tabelværdierne i</w:t>
+      </w:r>
+      <w:r>
+        <w:t xml:space="preserve"> </w:t>
+      </w:r>
+      <w:hyperlink w:anchor="tbl-4">
+        <w:r>
+          <w:rPr>
+            <w:rStyle w:val="Hyperlink"/>
+          </w:rPr>
+          <w:t xml:space="preserve">Tabel 4</w:t>
+        </w:r>
+      </w:hyperlink>
+      <w:r>
+        <w:t xml:space="preserve">, og beregn afvigelsen i procent på samme måde. Hvor stor er usikkerheden ved at aflæse 100 mL i måleglasset?</w:t>
+      </w:r>
+    </w:p>
+    <w:bookmarkEnd w:id="44"/>
+    <w:bookmarkStart w:id="45" w:name="journalspørgsmål"/>
+    <w:p>
+      <w:pPr>
+        <w:pStyle w:val="Heading2"/>
+      </w:pPr>
+      <w:r>
+        <w:t xml:space="preserve">Journalspørgsmål</w:t>
       </w:r>
     </w:p>
     <w:p>
@@ -1853,15 +2028,84 @@
         <w:pStyle w:val="Compact"/>
         <w:numPr>
           <w:ilvl w:val="0"/>
-          <w:numId w:val="1006"/>
+          <w:numId w:val="1008"/>
         </w:numPr>
       </w:pPr>
       <w:r>
-        <w:t xml:space="preserve">Råolie fra Nordsøen har en densitet omkring 0,85 g/cm³, mens det salte porevand i undergrunden er tungere end 1,00 g/cm³. Hvad betyder den forskel for oliens vej op gennem undergrunden?</w:t>
+        <w:t xml:space="preserve">Beskriv, hvad I så i glasset i del 2. Relatér derefter forsøget til teorien om oliedannelse, migration, kildebjergarter, reservoirbjergarter og oliefælder: hvilke af de begreber har vi i vores forsøg, og hvilke har vi ikke?</w:t>
+      </w:r>
+    </w:p>
+    <w:p>
+      <w:pPr>
+        <w:pStyle w:val="Compact"/>
+        <w:numPr>
+          <w:ilvl w:val="0"/>
+          <w:numId w:val="1008"/>
+        </w:numPr>
+      </w:pPr>
+      <w:r>
+        <w:t xml:space="preserve">Brug jeres densiteter fra del 3 til at forklare, hvorfor olien bevægede sig op gennem sandet — og hvorfor den blev liggende øverst.</w:t>
+      </w:r>
+    </w:p>
+    <w:p>
+      <w:pPr>
+        <w:pStyle w:val="Compact"/>
+        <w:numPr>
+          <w:ilvl w:val="0"/>
+          <w:numId w:val="1008"/>
+        </w:numPr>
+      </w:pPr>
+      <w:r>
+        <w:t xml:space="preserve">Råolie fra Nordsøen har en densitet omkring 0,85 g/cm³, mens det salte porevand i undergrunden er tungere end 1,00 g/cm³. Hvad betyder den forskel for oliens vej op gennem undergrunden, og hvad skal der til for at standse den i en oliefælde?</w:t>
+      </w:r>
+    </w:p>
+    <w:p>
+      <w:pPr>
+        <w:pStyle w:val="Compact"/>
+        <w:numPr>
+          <w:ilvl w:val="0"/>
+          <w:numId w:val="1008"/>
+        </w:numPr>
+      </w:pPr>
+      <w:r>
+        <w:t xml:space="preserve">Diskutér, hvilke energimæssige og miljømæssige konsekvenser det ville have haft, hvis oliens densitet havde været større end vands. Hvor ville vores Nordsøolie så befinde sig i dag, og hvad ville det betyde for vores muligheder for at bruge den?</w:t>
+      </w:r>
+    </w:p>
+    <w:p>
+      <w:pPr>
+        <w:pStyle w:val="Compact"/>
+        <w:numPr>
+          <w:ilvl w:val="0"/>
+          <w:numId w:val="1008"/>
+        </w:numPr>
+      </w:pPr>
+      <w:r>
+        <w:t xml:space="preserve">Hvilke problemer er der forbundet med olie som energiråstof?</w:t>
+      </w:r>
+    </w:p>
+    <w:p>
+      <w:pPr>
+        <w:pStyle w:val="Compact"/>
+        <w:numPr>
+          <w:ilvl w:val="0"/>
+          <w:numId w:val="1008"/>
+        </w:numPr>
+      </w:pPr>
+      <w:r>
+        <w:rPr>
+          <w:b/>
+          <w:bCs/>
+        </w:rPr>
+        <w:t xml:space="preserve">Fejlkilder.</w:t>
+      </w:r>
+      <w:r>
+        <w:t xml:space="preserve"> </w:t>
+      </w:r>
+      <w:r>
+        <w:t xml:space="preserve">Hvad er der fx galt ved at bruge vegetabilsk olie frem for mineralsk olie, og løst sand frem for sandsten? Find selv flere forskelle mellem modellen og undergrunden.</w:t>
       </w:r>
     </w:p>
     <w:bookmarkEnd w:id="45"/>
-    <w:bookmarkEnd w:id="46"/>
     <w:sectPr>
       <w:headerReference r:id="rId7" w:type="default"/>
       <w:footerReference r:id="rId8" w:type="default"/>
@@ -2389,6 +2633,176 @@
       </w:rPr>
     </w:lvl>
   </w:abstractNum>
+  <w:abstractNum w:abstractNumId="99413">
+    <w:nsid w:val="00A99413"/>
+    <w:multiLevelType w:val="multilevel"/>
+    <w:lvl w:ilvl="0">
+      <w:start w:val="3"/>
+      <w:numFmt w:val="decimal"/>
+      <w:lvlText w:val="%1."/>
+      <w:lvlJc w:val="left"/>
+      <w:pPr>
+        <w:ind w:left="720" w:hanging="360"/>
+      </w:pPr>
+    </w:lvl>
+    <w:lvl w:ilvl="1">
+      <w:start w:val="3"/>
+      <w:numFmt w:val="decimal"/>
+      <w:lvlText w:val="%2."/>
+      <w:lvlJc w:val="left"/>
+      <w:pPr>
+        <w:ind w:left="1440" w:hanging="360"/>
+      </w:pPr>
+    </w:lvl>
+    <w:lvl w:ilvl="2">
+      <w:start w:val="3"/>
+      <w:numFmt w:val="decimal"/>
+      <w:lvlText w:val="%3."/>
+      <w:lvlJc w:val="left"/>
+      <w:pPr>
+        <w:ind w:left="2160" w:hanging="360"/>
+      </w:pPr>
+    </w:lvl>
+    <w:lvl w:ilvl="3">
+      <w:start w:val="3"/>
+      <w:numFmt w:val="decimal"/>
+      <w:lvlText w:val="%4."/>
+      <w:lvlJc w:val="left"/>
+      <w:pPr>
+        <w:ind w:left="2880" w:hanging="360"/>
+      </w:pPr>
+    </w:lvl>
+    <w:lvl w:ilvl="4">
+      <w:start w:val="3"/>
+      <w:numFmt w:val="decimal"/>
+      <w:lvlText w:val="%5."/>
+      <w:lvlJc w:val="left"/>
+      <w:pPr>
+        <w:ind w:left="3600" w:hanging="360"/>
+      </w:pPr>
+    </w:lvl>
+    <w:lvl w:ilvl="5">
+      <w:start w:val="3"/>
+      <w:numFmt w:val="decimal"/>
+      <w:lvlText w:val="%6."/>
+      <w:lvlJc w:val="left"/>
+      <w:pPr>
+        <w:ind w:left="4320" w:hanging="360"/>
+      </w:pPr>
+    </w:lvl>
+    <w:lvl w:ilvl="6">
+      <w:start w:val="3"/>
+      <w:numFmt w:val="decimal"/>
+      <w:lvlText w:val="%7."/>
+      <w:lvlJc w:val="left"/>
+      <w:pPr>
+        <w:ind w:left="5040" w:hanging="360"/>
+      </w:pPr>
+    </w:lvl>
+    <w:lvl w:ilvl="7">
+      <w:start w:val="3"/>
+      <w:numFmt w:val="decimal"/>
+      <w:lvlText w:val="%8."/>
+      <w:lvlJc w:val="left"/>
+      <w:pPr>
+        <w:ind w:left="5760" w:hanging="360"/>
+      </w:pPr>
+    </w:lvl>
+    <w:lvl w:ilvl="8">
+      <w:start w:val="3"/>
+      <w:numFmt w:val="decimal"/>
+      <w:lvlText w:val="%9."/>
+      <w:lvlJc w:val="left"/>
+      <w:pPr>
+        <w:ind w:left="6480" w:hanging="360"/>
+      </w:pPr>
+    </w:lvl>
+  </w:abstractNum>
+  <w:abstractNum w:abstractNumId="99414">
+    <w:nsid w:val="00A99414"/>
+    <w:multiLevelType w:val="multilevel"/>
+    <w:lvl w:ilvl="0">
+      <w:start w:val="4"/>
+      <w:numFmt w:val="decimal"/>
+      <w:lvlText w:val="%1."/>
+      <w:lvlJc w:val="left"/>
+      <w:pPr>
+        <w:ind w:left="720" w:hanging="360"/>
+      </w:pPr>
+    </w:lvl>
+    <w:lvl w:ilvl="1">
+      <w:start w:val="4"/>
+      <w:numFmt w:val="decimal"/>
+      <w:lvlText w:val="%2."/>
+      <w:lvlJc w:val="left"/>
+      <w:pPr>
+        <w:ind w:left="1440" w:hanging="360"/>
+      </w:pPr>
+    </w:lvl>
+    <w:lvl w:ilvl="2">
+      <w:start w:val="4"/>
+      <w:numFmt w:val="decimal"/>
+      <w:lvlText w:val="%3."/>
+      <w:lvlJc w:val="left"/>
+      <w:pPr>
+        <w:ind w:left="2160" w:hanging="360"/>
+      </w:pPr>
+    </w:lvl>
+    <w:lvl w:ilvl="3">
+      <w:start w:val="4"/>
+      <w:numFmt w:val="decimal"/>
+      <w:lvlText w:val="%4."/>
+      <w:lvlJc w:val="left"/>
+      <w:pPr>
+        <w:ind w:left="2880" w:hanging="360"/>
+      </w:pPr>
+    </w:lvl>
+    <w:lvl w:ilvl="4">
+      <w:start w:val="4"/>
+      <w:numFmt w:val="decimal"/>
+      <w:lvlText w:val="%5."/>
+      <w:lvlJc w:val="left"/>
+      <w:pPr>
+        <w:ind w:left="3600" w:hanging="360"/>
+      </w:pPr>
+    </w:lvl>
+    <w:lvl w:ilvl="5">
+      <w:start w:val="4"/>
+      <w:numFmt w:val="decimal"/>
+      <w:lvlText w:val="%6."/>
+      <w:lvlJc w:val="left"/>
+      <w:pPr>
+        <w:ind w:left="4320" w:hanging="360"/>
+      </w:pPr>
+    </w:lvl>
+    <w:lvl w:ilvl="6">
+      <w:start w:val="4"/>
+      <w:numFmt w:val="decimal"/>
+      <w:lvlText w:val="%7."/>
+      <w:lvlJc w:val="left"/>
+      <w:pPr>
+        <w:ind w:left="5040" w:hanging="360"/>
+      </w:pPr>
+    </w:lvl>
+    <w:lvl w:ilvl="7">
+      <w:start w:val="4"/>
+      <w:numFmt w:val="decimal"/>
+      <w:lvlText w:val="%8."/>
+      <w:lvlJc w:val="left"/>
+      <w:pPr>
+        <w:ind w:left="5760" w:hanging="360"/>
+      </w:pPr>
+    </w:lvl>
+    <w:lvl w:ilvl="8">
+      <w:start w:val="4"/>
+      <w:numFmt w:val="decimal"/>
+      <w:lvlText w:val="%9."/>
+      <w:lvlJc w:val="left"/>
+      <w:pPr>
+        <w:ind w:left="6480" w:hanging="360"/>
+      </w:pPr>
+    </w:lvl>
+  </w:abstractNum>
   <w:num w:numId="1">
     <w:abstractNumId w:val="1"/>
     <w:lvlOverride w:ilvl="0">
@@ -2534,6 +2948,66 @@
     </w:lvlOverride>
   </w:num>
   <w:num w:numId="1006">
+    <w:abstractNumId w:val="99413"/>
+    <w:lvlOverride w:ilvl="0">
+      <w:startOverride w:val="3"/>
+    </w:lvlOverride>
+    <w:lvlOverride w:ilvl="1">
+      <w:startOverride w:val="3"/>
+    </w:lvlOverride>
+    <w:lvlOverride w:ilvl="2">
+      <w:startOverride w:val="3"/>
+    </w:lvlOverride>
+    <w:lvlOverride w:ilvl="3">
+      <w:startOverride w:val="3"/>
+    </w:lvlOverride>
+    <w:lvlOverride w:ilvl="4">
+      <w:startOverride w:val="3"/>
+    </w:lvlOverride>
+    <w:lvlOverride w:ilvl="5">
+      <w:startOverride w:val="3"/>
+    </w:lvlOverride>
+    <w:lvlOverride w:ilvl="6">
+      <w:startOverride w:val="3"/>
+    </w:lvlOverride>
+    <w:lvlOverride w:ilvl="7">
+      <w:startOverride w:val="3"/>
+    </w:lvlOverride>
+    <w:lvlOverride w:ilvl="8">
+      <w:startOverride w:val="3"/>
+    </w:lvlOverride>
+  </w:num>
+  <w:num w:numId="1007">
+    <w:abstractNumId w:val="99414"/>
+    <w:lvlOverride w:ilvl="0">
+      <w:startOverride w:val="4"/>
+    </w:lvlOverride>
+    <w:lvlOverride w:ilvl="1">
+      <w:startOverride w:val="4"/>
+    </w:lvlOverride>
+    <w:lvlOverride w:ilvl="2">
+      <w:startOverride w:val="4"/>
+    </w:lvlOverride>
+    <w:lvlOverride w:ilvl="3">
+      <w:startOverride w:val="4"/>
+    </w:lvlOverride>
+    <w:lvlOverride w:ilvl="4">
+      <w:startOverride w:val="4"/>
+    </w:lvlOverride>
+    <w:lvlOverride w:ilvl="5">
+      <w:startOverride w:val="4"/>
+    </w:lvlOverride>
+    <w:lvlOverride w:ilvl="6">
+      <w:startOverride w:val="4"/>
+    </w:lvlOverride>
+    <w:lvlOverride w:ilvl="7">
+      <w:startOverride w:val="4"/>
+    </w:lvlOverride>
+    <w:lvlOverride w:ilvl="8">
+      <w:startOverride w:val="4"/>
+    </w:lvlOverride>
+  </w:num>
+  <w:num w:numId="1008">
     <w:abstractNumId w:val="99411"/>
     <w:lvlOverride w:ilvl="0">
       <w:startOverride w:val="1"/>

</xml_diff>